<commit_message>
implemented system upgrades and chnages
</commit_message>
<xml_diff>
--- a/Terms of Reference  for a centralized Internal Audit Management Software (IAMS).docx
+++ b/Terms of Reference  for a centralized Internal Audit Management Software (IAMS).docx
@@ -47,15 +47,7 @@
         <w:ind w:left="360" w:right="156"/>
       </w:pPr>
       <w:r>
-        <w:t xml:space="preserve">The objective of this document is to provide the Procurement unit of Galaxy Backbone (GBB) with a scope of work for a centralized Internal Audit Management Software (IAMS) for the Internal Audit unit of GBB. The proposed solution will be modular and scalable, featuring an architecture that integrates seamlessly with GBB's existing internal systems. This includes critical connections to </w:t>
-      </w:r>
-      <w:proofErr w:type="spellStart"/>
-      <w:r>
-        <w:t>Dynafin</w:t>
-      </w:r>
-      <w:proofErr w:type="spellEnd"/>
-      <w:r>
-        <w:t xml:space="preserve"> for financial testing, the IMOC ITSM platform for operational audits, and Active</w:t>
+        <w:t>The objective of this document is to provide the Procurement unit of Galaxy Backbone (GBB) with a scope of work for a centralized Internal Audit Management Software (IAMS) for the Internal Audit unit of GBB. The proposed solution will be modular and scalable, featuring an architecture that integrates seamlessly with GBB's existing internal systems. This includes critical connections to Dynafin for financial testing, the IMOC ITSM platform for operational audits, and Active</w:t>
       </w:r>
       <w:r>
         <w:rPr>
@@ -1268,14 +1260,12 @@
         </w:rPr>
         <w:t xml:space="preserve"> </w:t>
       </w:r>
-      <w:proofErr w:type="spellStart"/>
       <w:r>
         <w:rPr>
           <w:sz w:val="24"/>
         </w:rPr>
         <w:t>Dynafin</w:t>
       </w:r>
-      <w:proofErr w:type="spellEnd"/>
       <w:r>
         <w:rPr>
           <w:spacing w:val="-1"/>
@@ -2725,14 +2715,12 @@
         </w:rPr>
         <w:t xml:space="preserve"> </w:t>
       </w:r>
-      <w:proofErr w:type="spellStart"/>
       <w:r>
         <w:rPr>
           <w:sz w:val="24"/>
         </w:rPr>
         <w:t>Dynafin</w:t>
       </w:r>
-      <w:proofErr w:type="spellEnd"/>
       <w:r>
         <w:rPr>
           <w:spacing w:val="-5"/>
@@ -5285,14 +5273,12 @@
         </w:rPr>
         <w:t xml:space="preserve"> </w:t>
       </w:r>
-      <w:proofErr w:type="spellStart"/>
       <w:r>
         <w:rPr>
           <w:sz w:val="24"/>
         </w:rPr>
         <w:t>Dynafin</w:t>
       </w:r>
-      <w:proofErr w:type="spellEnd"/>
       <w:r>
         <w:rPr>
           <w:spacing w:val="-5"/>
@@ -7000,14 +6986,12 @@
         </w:rPr>
         <w:t xml:space="preserve"> </w:t>
       </w:r>
-      <w:proofErr w:type="spellStart"/>
       <w:r>
         <w:rPr>
           <w:sz w:val="24"/>
         </w:rPr>
         <w:t>Dynafin</w:t>
       </w:r>
-      <w:proofErr w:type="spellEnd"/>
       <w:r>
         <w:rPr>
           <w:spacing w:val="-4"/>

</xml_diff>